<commit_message>
update OLD files might need them?
</commit_message>
<xml_diff>
--- a/docs/info/epa_1-2_doc_2025/EPA_AE1/EPA_AE1_SE/Report_SE_AE1/DATS_SE_1-2-AE1_Project_info_25_v1.docx
+++ b/docs/info/epa_1-2_doc_2025/EPA_AE1/EPA_AE1_SE/Report_SE_AE1/DATS_SE_1-2-AE1_Project_info_25_v1.docx
@@ -1681,7 +1681,7 @@
           <w14:ligatures w14:val="none"/>
         </w:rPr>
         <w:drawing>
-          <wp:anchor distT="0" distB="0" distL="114300" distR="114300" simplePos="0" relativeHeight="251658240" behindDoc="0" locked="0" layoutInCell="1" allowOverlap="1" wp14:anchorId="22EDCA6E" wp14:editId="47BC5D7D">
+          <wp:anchor distT="0" distB="0" distL="114300" distR="114300" simplePos="0" relativeHeight="251658240" behindDoc="0" locked="0" layoutInCell="1" allowOverlap="1" wp14:anchorId="22EDCA6E" wp14:editId="6BC0E3BB">
             <wp:simplePos x="0" y="0"/>
             <wp:positionH relativeFrom="column">
               <wp:posOffset>3335456</wp:posOffset>
@@ -1706,7 +1706,7 @@
                     </pic:cNvPicPr>
                   </pic:nvPicPr>
                   <pic:blipFill>
-                    <a:blip r:embed="rId13">
+                    <a:blip r:embed="rId13" cstate="print">
                       <a:extLst>
                         <a:ext uri="{28A0092B-C50C-407E-A947-70E740481C1C}">
                           <a14:useLocalDpi xmlns:a14="http://schemas.microsoft.com/office/drawing/2010/main" val="0"/>
@@ -15743,7 +15743,25 @@
                 <w:sz w:val="16"/>
                 <w:szCs w:val="16"/>
               </w:rPr>
-              <w:t>Evaluate learning points arising from software engineering work undertaken on a project including use of methods, analysis undertaken, selection of approach and the outcome achieved, in order to identify both lessons learnt and recommendations for improvements to future projects.</w:t>
+              <w:t xml:space="preserve">Evaluate learning points arising from software engineering work undertaken on a project including use of methods, analysis undertaken, selection of approach and the outcome achieved, </w:t>
+            </w:r>
+            <w:proofErr w:type="gramStart"/>
+            <w:r>
+              <w:rPr>
+                <w:rFonts w:ascii="Trebuchet MS" w:hAnsi="Trebuchet MS" w:cs="Calibri"/>
+                <w:sz w:val="16"/>
+                <w:szCs w:val="16"/>
+              </w:rPr>
+              <w:t>in order to</w:t>
+            </w:r>
+            <w:proofErr w:type="gramEnd"/>
+            <w:r>
+              <w:rPr>
+                <w:rFonts w:ascii="Trebuchet MS" w:hAnsi="Trebuchet MS" w:cs="Calibri"/>
+                <w:sz w:val="16"/>
+                <w:szCs w:val="16"/>
+              </w:rPr>
+              <w:t xml:space="preserve"> identify both lessons learnt and recommendations for improvements to future projects.</w:t>
             </w:r>
           </w:p>
         </w:tc>
@@ -22562,6 +22580,13 @@
           <w:szCs w:val="16"/>
         </w:rPr>
       </w:pPr>
+      <w:r>
+        <w:rPr>
+          <w:sz w:val="16"/>
+          <w:szCs w:val="16"/>
+        </w:rPr>
+        <w:br/>
+      </w:r>
     </w:p>
     <w:tbl>
       <w:tblPr>
@@ -22632,868 +22657,8 @@
                 <w:lang w:eastAsia="en-GB"/>
                 <w14:ligatures w14:val="none"/>
               </w:rPr>
-              <w:t xml:space="preserve"> 1</w:t>
-            </w:r>
-          </w:p>
-        </w:tc>
-      </w:tr>
-      <w:tr>
-        <w:trPr>
-          <w:trHeight w:val="1851"/>
-        </w:trPr>
-        <w:tc>
-          <w:tcPr>
-            <w:tcW w:w="2521" w:type="dxa"/>
-            <w:gridSpan w:val="2"/>
-            <w:vMerge w:val="restart"/>
-            <w:tcBorders>
-              <w:top w:val="single" w:sz="6" w:space="0" w:color="334047"/>
-              <w:left w:val="single" w:sz="6" w:space="0" w:color="334047"/>
-              <w:right w:val="single" w:sz="6" w:space="0" w:color="334047"/>
-            </w:tcBorders>
-            <w:shd w:val="clear" w:color="auto" w:fill="F8E4F5"/>
-            <w:tcMar>
-              <w:top w:w="75" w:type="dxa"/>
-              <w:left w:w="150" w:type="dxa"/>
-              <w:bottom w:w="75" w:type="dxa"/>
-              <w:right w:w="150" w:type="dxa"/>
-            </w:tcMar>
-            <w:hideMark/>
-          </w:tcPr>
-          <w:p>
-            <w:pPr>
-              <w:rPr>
-                <w:sz w:val="18"/>
-                <w:szCs w:val="18"/>
-              </w:rPr>
-            </w:pPr>
-            <w:r>
-              <w:rPr>
-                <w:rFonts w:ascii="Calibri" w:hAnsi="Calibri" w:cs="Calibri"/>
-                <w:sz w:val="18"/>
-                <w:szCs w:val="18"/>
-              </w:rPr>
-              <w:t xml:space="preserve">Software Engineer </w:t>
-            </w:r>
-            <w:r>
-              <w:rPr>
-                <w:rFonts w:ascii="Calibri" w:hAnsi="Calibri" w:cs="Calibri"/>
-                <w:sz w:val="18"/>
-                <w:szCs w:val="18"/>
-              </w:rPr>
-              <w:t xml:space="preserve">- </w:t>
-            </w:r>
-            <w:r>
-              <w:rPr>
-                <w:rFonts w:ascii="Calibri" w:hAnsi="Calibri" w:cs="Calibri"/>
-                <w:sz w:val="18"/>
-                <w:szCs w:val="18"/>
-              </w:rPr>
-              <w:t>Innovation and Response </w:t>
-            </w:r>
-            <w:r>
-              <w:rPr>
-                <w:rFonts w:ascii="Calibri" w:hAnsi="Calibri" w:cs="Calibri"/>
-                <w:sz w:val="18"/>
-                <w:szCs w:val="18"/>
-              </w:rPr>
-              <w:br/>
-            </w:r>
-            <w:r>
-              <w:rPr>
-                <w:rFonts w:ascii="Calibri" w:hAnsi="Calibri" w:cs="Calibri"/>
-                <w:b/>
-                <w:bCs/>
-                <w:sz w:val="18"/>
-                <w:szCs w:val="18"/>
-              </w:rPr>
-              <w:t>(Theme C)</w:t>
-            </w:r>
-            <w:r>
-              <w:rPr>
-                <w:rFonts w:ascii="Calibri" w:hAnsi="Calibri" w:cs="Calibri"/>
-                <w:sz w:val="18"/>
-                <w:szCs w:val="18"/>
-              </w:rPr>
               <w:t xml:space="preserve"> </w:t>
             </w:r>
-            <w:r>
-              <w:rPr>
-                <w:rFonts w:ascii="Calibri" w:hAnsi="Calibri" w:cs="Calibri"/>
-                <w:sz w:val="18"/>
-                <w:szCs w:val="18"/>
-              </w:rPr>
-              <w:br/>
-            </w:r>
-            <w:r>
-              <w:rPr>
-                <w:rFonts w:ascii="Calibri" w:hAnsi="Calibri" w:cs="Calibri"/>
-                <w:b/>
-                <w:bCs/>
-                <w:color w:val="EE0000"/>
-                <w:sz w:val="18"/>
-                <w:szCs w:val="18"/>
-              </w:rPr>
-              <w:t>S16 S17 S18 S19 S22</w:t>
-            </w:r>
-          </w:p>
-        </w:tc>
-        <w:tc>
-          <w:tcPr>
-            <w:tcW w:w="4154" w:type="dxa"/>
-            <w:gridSpan w:val="3"/>
-            <w:tcBorders>
-              <w:top w:val="single" w:sz="6" w:space="0" w:color="334047"/>
-              <w:left w:val="single" w:sz="6" w:space="0" w:color="334047"/>
-              <w:bottom w:val="single" w:sz="6" w:space="0" w:color="334047"/>
-              <w:right w:val="single" w:sz="6" w:space="0" w:color="334047"/>
-            </w:tcBorders>
-            <w:shd w:val="clear" w:color="auto" w:fill="F8E4F5"/>
-            <w:tcMar>
-              <w:top w:w="75" w:type="dxa"/>
-              <w:left w:w="150" w:type="dxa"/>
-              <w:bottom w:w="75" w:type="dxa"/>
-              <w:right w:w="150" w:type="dxa"/>
-            </w:tcMar>
-            <w:hideMark/>
-          </w:tcPr>
-          <w:p>
-            <w:pPr>
-              <w:spacing w:after="160" w:line="278" w:lineRule="auto"/>
-              <w:rPr>
-                <w:rFonts w:ascii="Calibri" w:hAnsi="Calibri" w:cs="Calibri"/>
-                <w:sz w:val="18"/>
-                <w:szCs w:val="18"/>
-              </w:rPr>
-            </w:pPr>
-            <w:r>
-              <w:rPr>
-                <w:rFonts w:ascii="Calibri" w:hAnsi="Calibri" w:cs="Calibri"/>
-                <w:sz w:val="18"/>
-                <w:szCs w:val="18"/>
-              </w:rPr>
-              <w:t xml:space="preserve">Identifies and defines a non-routine, unspecified software engineering problem. </w:t>
-            </w:r>
-            <w:r>
-              <w:rPr>
-                <w:rFonts w:ascii="Calibri" w:hAnsi="Calibri" w:cs="Calibri"/>
-                <w:b/>
-                <w:bCs/>
-                <w:color w:val="EE0000"/>
-                <w:sz w:val="18"/>
-                <w:szCs w:val="18"/>
-              </w:rPr>
-              <w:t>(S16/SES1)</w:t>
-            </w:r>
-            <w:r>
-              <w:rPr>
-                <w:rFonts w:ascii="Calibri" w:hAnsi="Calibri" w:cs="Calibri"/>
-                <w:color w:val="EE0000"/>
-                <w:sz w:val="18"/>
-                <w:szCs w:val="18"/>
-              </w:rPr>
-              <w:t xml:space="preserve">  </w:t>
-            </w:r>
-          </w:p>
-          <w:p>
-            <w:pPr>
-              <w:pStyle w:val="NormalWeb"/>
-              <w:spacing w:before="0" w:beforeAutospacing="0" w:after="240" w:afterAutospacing="0"/>
-              <w:ind w:left="-27"/>
-              <w:textAlignment w:val="baseline"/>
-              <w:rPr>
-                <w:rFonts w:asciiTheme="minorHAnsi" w:hAnsiTheme="minorHAnsi" w:cs="Open Sans"/>
-                <w:color w:val="EE0000"/>
-                <w:sz w:val="18"/>
-                <w:szCs w:val="18"/>
-              </w:rPr>
-            </w:pPr>
-            <w:r>
-              <w:rPr>
-                <w:rFonts w:ascii="Calibri" w:hAnsi="Calibri" w:cs="Calibri"/>
-                <w:sz w:val="18"/>
-                <w:szCs w:val="18"/>
-              </w:rPr>
-              <w:t>Evaluates their selection of approach, methodology, analysis and outcomes to identify both lessons learned and recommendations for improvements to future projects software engineering projects</w:t>
-            </w:r>
-            <w:r>
-              <w:rPr>
-                <w:rFonts w:ascii="Calibri" w:hAnsi="Calibri" w:cs="Calibri"/>
-                <w:b/>
-                <w:bCs/>
-                <w:color w:val="EE0000"/>
-                <w:sz w:val="18"/>
-                <w:szCs w:val="18"/>
-              </w:rPr>
-              <w:t>. (S22/SES7)</w:t>
-            </w:r>
-          </w:p>
-        </w:tc>
-        <w:tc>
-          <w:tcPr>
-            <w:tcW w:w="4155" w:type="dxa"/>
-            <w:gridSpan w:val="3"/>
-            <w:tcBorders>
-              <w:top w:val="single" w:sz="6" w:space="0" w:color="334047"/>
-              <w:left w:val="single" w:sz="6" w:space="0" w:color="334047"/>
-              <w:bottom w:val="single" w:sz="6" w:space="0" w:color="334047"/>
-              <w:right w:val="single" w:sz="6" w:space="0" w:color="334047"/>
-            </w:tcBorders>
-            <w:shd w:val="clear" w:color="auto" w:fill="F8E4F5"/>
-          </w:tcPr>
-          <w:p>
-            <w:pPr>
-              <w:spacing w:after="160" w:line="278" w:lineRule="auto"/>
-              <w:rPr>
-                <w:rFonts w:cs="Open Sans"/>
-                <w:color w:val="EE0000"/>
-                <w:sz w:val="18"/>
-                <w:szCs w:val="18"/>
-              </w:rPr>
-            </w:pPr>
-          </w:p>
-        </w:tc>
-      </w:tr>
-      <w:tr>
-        <w:trPr>
-          <w:trHeight w:val="691"/>
-        </w:trPr>
-        <w:tc>
-          <w:tcPr>
-            <w:tcW w:w="2521" w:type="dxa"/>
-            <w:gridSpan w:val="2"/>
-            <w:vMerge/>
-            <w:tcBorders>
-              <w:left w:val="single" w:sz="6" w:space="0" w:color="334047"/>
-              <w:right w:val="single" w:sz="6" w:space="0" w:color="334047"/>
-            </w:tcBorders>
-            <w:shd w:val="clear" w:color="auto" w:fill="F8E4F5"/>
-            <w:tcMar>
-              <w:top w:w="75" w:type="dxa"/>
-              <w:left w:w="150" w:type="dxa"/>
-              <w:bottom w:w="75" w:type="dxa"/>
-              <w:right w:w="150" w:type="dxa"/>
-            </w:tcMar>
-          </w:tcPr>
-          <w:p>
-            <w:pPr>
-              <w:rPr>
-                <w:sz w:val="18"/>
-                <w:szCs w:val="18"/>
-              </w:rPr>
-            </w:pPr>
-          </w:p>
-        </w:tc>
-        <w:tc>
-          <w:tcPr>
-            <w:tcW w:w="4154" w:type="dxa"/>
-            <w:gridSpan w:val="3"/>
-            <w:tcBorders>
-              <w:top w:val="single" w:sz="6" w:space="0" w:color="334047"/>
-              <w:left w:val="single" w:sz="6" w:space="0" w:color="334047"/>
-              <w:bottom w:val="single" w:sz="6" w:space="0" w:color="334047"/>
-              <w:right w:val="single" w:sz="6" w:space="0" w:color="334047"/>
-            </w:tcBorders>
-            <w:shd w:val="clear" w:color="auto" w:fill="F8E4F5"/>
-            <w:tcMar>
-              <w:top w:w="75" w:type="dxa"/>
-              <w:left w:w="150" w:type="dxa"/>
-              <w:bottom w:w="75" w:type="dxa"/>
-              <w:right w:w="150" w:type="dxa"/>
-            </w:tcMar>
-          </w:tcPr>
-          <w:p>
-            <w:pPr>
-              <w:spacing w:after="160" w:line="278" w:lineRule="auto"/>
-              <w:rPr>
-                <w:rFonts w:ascii="Calibri" w:hAnsi="Calibri" w:cs="Calibri"/>
-                <w:b/>
-                <w:bCs/>
-                <w:color w:val="EE0000"/>
-                <w:sz w:val="18"/>
-                <w:szCs w:val="18"/>
-              </w:rPr>
-            </w:pPr>
-            <w:r>
-              <w:rPr>
-                <w:rFonts w:ascii="Calibri" w:hAnsi="Calibri" w:cs="Calibri"/>
-                <w:sz w:val="18"/>
-                <w:szCs w:val="18"/>
-              </w:rPr>
-              <w:t>Recommends a software engineering solution that is appropriate for the project brief</w:t>
-            </w:r>
-            <w:r>
-              <w:rPr>
-                <w:rFonts w:ascii="Calibri" w:hAnsi="Calibri" w:cs="Calibri"/>
-                <w:b/>
-                <w:bCs/>
-                <w:color w:val="EE0000"/>
-                <w:sz w:val="18"/>
-                <w:szCs w:val="18"/>
-              </w:rPr>
-              <w:t>. (S17/SES2)</w:t>
-            </w:r>
-          </w:p>
-        </w:tc>
-        <w:tc>
-          <w:tcPr>
-            <w:tcW w:w="4155" w:type="dxa"/>
-            <w:gridSpan w:val="3"/>
-            <w:tcBorders>
-              <w:top w:val="single" w:sz="6" w:space="0" w:color="334047"/>
-              <w:left w:val="single" w:sz="6" w:space="0" w:color="334047"/>
-              <w:bottom w:val="single" w:sz="6" w:space="0" w:color="334047"/>
-              <w:right w:val="single" w:sz="6" w:space="0" w:color="334047"/>
-            </w:tcBorders>
-            <w:shd w:val="clear" w:color="auto" w:fill="F8E4F5"/>
-          </w:tcPr>
-          <w:p>
-            <w:pPr>
-              <w:spacing w:after="160" w:line="278" w:lineRule="auto"/>
-              <w:ind w:left="115"/>
-              <w:rPr>
-                <w:rFonts w:ascii="Calibri" w:hAnsi="Calibri" w:cs="Calibri"/>
-                <w:sz w:val="18"/>
-                <w:szCs w:val="18"/>
-              </w:rPr>
-            </w:pPr>
-            <w:r>
-              <w:rPr>
-                <w:rFonts w:ascii="Calibri" w:hAnsi="Calibri" w:cs="Calibri"/>
-                <w:sz w:val="18"/>
-                <w:szCs w:val="18"/>
-              </w:rPr>
-              <w:t xml:space="preserve">Evaluates their choice of software engineering solution for the project brief. </w:t>
-            </w:r>
-            <w:r>
-              <w:rPr>
-                <w:rFonts w:ascii="Calibri" w:hAnsi="Calibri" w:cs="Calibri"/>
-                <w:b/>
-                <w:bCs/>
-                <w:color w:val="EE0000"/>
-                <w:sz w:val="18"/>
-                <w:szCs w:val="18"/>
-              </w:rPr>
-              <w:t>(S17/SES2)</w:t>
-            </w:r>
-            <w:r>
-              <w:rPr>
-                <w:rFonts w:ascii="Calibri" w:hAnsi="Calibri" w:cs="Calibri"/>
-                <w:color w:val="EE0000"/>
-                <w:sz w:val="18"/>
-                <w:szCs w:val="18"/>
-              </w:rPr>
-              <w:t> </w:t>
-            </w:r>
-          </w:p>
-        </w:tc>
-      </w:tr>
-      <w:tr>
-        <w:tc>
-          <w:tcPr>
-            <w:tcW w:w="2521" w:type="dxa"/>
-            <w:gridSpan w:val="2"/>
-            <w:vMerge/>
-            <w:tcBorders>
-              <w:left w:val="single" w:sz="6" w:space="0" w:color="334047"/>
-              <w:right w:val="single" w:sz="6" w:space="0" w:color="334047"/>
-            </w:tcBorders>
-            <w:shd w:val="clear" w:color="auto" w:fill="F8E4F5"/>
-            <w:tcMar>
-              <w:top w:w="75" w:type="dxa"/>
-              <w:left w:w="150" w:type="dxa"/>
-              <w:bottom w:w="75" w:type="dxa"/>
-              <w:right w:w="150" w:type="dxa"/>
-            </w:tcMar>
-          </w:tcPr>
-          <w:p>
-            <w:pPr>
-              <w:rPr>
-                <w:sz w:val="18"/>
-                <w:szCs w:val="18"/>
-              </w:rPr>
-            </w:pPr>
-          </w:p>
-        </w:tc>
-        <w:tc>
-          <w:tcPr>
-            <w:tcW w:w="4154" w:type="dxa"/>
-            <w:gridSpan w:val="3"/>
-            <w:tcBorders>
-              <w:top w:val="single" w:sz="6" w:space="0" w:color="334047"/>
-              <w:left w:val="single" w:sz="6" w:space="0" w:color="334047"/>
-              <w:bottom w:val="single" w:sz="6" w:space="0" w:color="334047"/>
-              <w:right w:val="single" w:sz="6" w:space="0" w:color="334047"/>
-            </w:tcBorders>
-            <w:shd w:val="clear" w:color="auto" w:fill="F8E4F5"/>
-            <w:tcMar>
-              <w:top w:w="75" w:type="dxa"/>
-              <w:left w:w="150" w:type="dxa"/>
-              <w:bottom w:w="75" w:type="dxa"/>
-              <w:right w:w="150" w:type="dxa"/>
-            </w:tcMar>
-          </w:tcPr>
-          <w:p>
-            <w:pPr>
-              <w:spacing w:after="160" w:line="278" w:lineRule="auto"/>
-              <w:rPr>
-                <w:rFonts w:ascii="Calibri" w:hAnsi="Calibri" w:cs="Calibri"/>
-                <w:sz w:val="18"/>
-                <w:szCs w:val="18"/>
-              </w:rPr>
-            </w:pPr>
-            <w:r>
-              <w:rPr>
-                <w:rFonts w:ascii="Calibri" w:hAnsi="Calibri" w:cs="Calibri"/>
-                <w:sz w:val="18"/>
-                <w:szCs w:val="18"/>
-              </w:rPr>
-              <w:t xml:space="preserve">Selects and applies analysis methods, approaches and techniques in software engineering projects to deliver an outcome that meets requirements. </w:t>
-            </w:r>
-            <w:r>
-              <w:rPr>
-                <w:rFonts w:ascii="Calibri" w:hAnsi="Calibri" w:cs="Calibri"/>
-                <w:b/>
-                <w:bCs/>
-                <w:color w:val="EE0000"/>
-                <w:sz w:val="18"/>
-                <w:szCs w:val="18"/>
-              </w:rPr>
-              <w:t>(S18/SES3)</w:t>
-            </w:r>
-            <w:r>
-              <w:rPr>
-                <w:rFonts w:ascii="Calibri" w:hAnsi="Calibri" w:cs="Calibri"/>
-                <w:color w:val="EE0000"/>
-                <w:sz w:val="18"/>
-                <w:szCs w:val="18"/>
-              </w:rPr>
-              <w:t> </w:t>
-            </w:r>
-          </w:p>
-        </w:tc>
-        <w:tc>
-          <w:tcPr>
-            <w:tcW w:w="4155" w:type="dxa"/>
-            <w:gridSpan w:val="3"/>
-            <w:tcBorders>
-              <w:top w:val="single" w:sz="6" w:space="0" w:color="334047"/>
-              <w:left w:val="single" w:sz="6" w:space="0" w:color="334047"/>
-              <w:bottom w:val="single" w:sz="6" w:space="0" w:color="334047"/>
-              <w:right w:val="single" w:sz="6" w:space="0" w:color="334047"/>
-            </w:tcBorders>
-            <w:shd w:val="clear" w:color="auto" w:fill="F8E4F5"/>
-          </w:tcPr>
-          <w:p>
-            <w:pPr>
-              <w:spacing w:after="160" w:line="278" w:lineRule="auto"/>
-              <w:ind w:left="115"/>
-              <w:rPr>
-                <w:rFonts w:ascii="Calibri" w:hAnsi="Calibri" w:cs="Calibri"/>
-                <w:sz w:val="18"/>
-                <w:szCs w:val="18"/>
-              </w:rPr>
-            </w:pPr>
-            <w:r>
-              <w:rPr>
-                <w:rFonts w:ascii="Calibri" w:hAnsi="Calibri" w:cs="Calibri"/>
-                <w:sz w:val="18"/>
-                <w:szCs w:val="18"/>
-              </w:rPr>
-              <w:t>Justifies their choice of analysis methods approaches and techniques</w:t>
-            </w:r>
-            <w:r>
-              <w:rPr>
-                <w:rFonts w:ascii="Calibri" w:hAnsi="Calibri" w:cs="Calibri"/>
-                <w:color w:val="EE0000"/>
-                <w:sz w:val="18"/>
-                <w:szCs w:val="18"/>
-              </w:rPr>
-              <w:t xml:space="preserve">. </w:t>
-            </w:r>
-            <w:r>
-              <w:rPr>
-                <w:rFonts w:ascii="Calibri" w:hAnsi="Calibri" w:cs="Calibri"/>
-                <w:b/>
-                <w:bCs/>
-                <w:color w:val="EE0000"/>
-                <w:sz w:val="18"/>
-                <w:szCs w:val="18"/>
-              </w:rPr>
-              <w:t>(S18/SE3)</w:t>
-            </w:r>
-          </w:p>
-          <w:p>
-            <w:pPr>
-              <w:pStyle w:val="NormalWeb"/>
-              <w:spacing w:before="0" w:beforeAutospacing="0" w:after="240" w:afterAutospacing="0"/>
-              <w:ind w:left="115"/>
-              <w:textAlignment w:val="baseline"/>
-              <w:rPr>
-                <w:rFonts w:asciiTheme="minorHAnsi" w:hAnsiTheme="minorHAnsi" w:cs="Open Sans"/>
-                <w:color w:val="000000"/>
-                <w:sz w:val="18"/>
-                <w:szCs w:val="18"/>
-              </w:rPr>
-            </w:pPr>
-          </w:p>
-        </w:tc>
-      </w:tr>
-      <w:tr>
-        <w:trPr>
-          <w:trHeight w:val="1219"/>
-        </w:trPr>
-        <w:tc>
-          <w:tcPr>
-            <w:tcW w:w="2521" w:type="dxa"/>
-            <w:gridSpan w:val="2"/>
-            <w:vMerge/>
-            <w:tcBorders>
-              <w:left w:val="single" w:sz="6" w:space="0" w:color="334047"/>
-              <w:right w:val="single" w:sz="6" w:space="0" w:color="334047"/>
-            </w:tcBorders>
-            <w:shd w:val="clear" w:color="auto" w:fill="F8E4F5"/>
-            <w:tcMar>
-              <w:top w:w="75" w:type="dxa"/>
-              <w:left w:w="150" w:type="dxa"/>
-              <w:bottom w:w="75" w:type="dxa"/>
-              <w:right w:w="150" w:type="dxa"/>
-            </w:tcMar>
-          </w:tcPr>
-          <w:p>
-            <w:pPr>
-              <w:rPr>
-                <w:sz w:val="18"/>
-                <w:szCs w:val="18"/>
-              </w:rPr>
-            </w:pPr>
-          </w:p>
-        </w:tc>
-        <w:tc>
-          <w:tcPr>
-            <w:tcW w:w="4154" w:type="dxa"/>
-            <w:gridSpan w:val="3"/>
-            <w:tcBorders>
-              <w:top w:val="single" w:sz="6" w:space="0" w:color="334047"/>
-              <w:left w:val="single" w:sz="6" w:space="0" w:color="334047"/>
-              <w:right w:val="single" w:sz="6" w:space="0" w:color="334047"/>
-            </w:tcBorders>
-            <w:shd w:val="clear" w:color="auto" w:fill="F8E4F5"/>
-            <w:tcMar>
-              <w:top w:w="75" w:type="dxa"/>
-              <w:left w:w="150" w:type="dxa"/>
-              <w:bottom w:w="75" w:type="dxa"/>
-              <w:right w:w="150" w:type="dxa"/>
-            </w:tcMar>
-          </w:tcPr>
-          <w:p>
-            <w:pPr>
-              <w:spacing w:after="160" w:line="278" w:lineRule="auto"/>
-              <w:rPr>
-                <w:rFonts w:ascii="Calibri" w:hAnsi="Calibri" w:cs="Calibri"/>
-                <w:sz w:val="18"/>
-                <w:szCs w:val="18"/>
-              </w:rPr>
-            </w:pPr>
-            <w:r>
-              <w:rPr>
-                <w:rFonts w:ascii="Calibri" w:hAnsi="Calibri" w:cs="Calibri"/>
-                <w:sz w:val="18"/>
-                <w:szCs w:val="18"/>
-              </w:rPr>
-              <w:t xml:space="preserve">Demonstrates how they implement software engineering projects using appropriate software engineering methods, approaches and techniques. </w:t>
-            </w:r>
-            <w:r>
-              <w:rPr>
-                <w:rFonts w:ascii="Calibri" w:hAnsi="Calibri" w:cs="Calibri"/>
-                <w:b/>
-                <w:bCs/>
-                <w:color w:val="EE0000"/>
-                <w:sz w:val="18"/>
-                <w:szCs w:val="18"/>
-              </w:rPr>
-              <w:t>(S19/SES4)</w:t>
-            </w:r>
-          </w:p>
-        </w:tc>
-        <w:tc>
-          <w:tcPr>
-            <w:tcW w:w="4155" w:type="dxa"/>
-            <w:gridSpan w:val="3"/>
-            <w:tcBorders>
-              <w:top w:val="single" w:sz="6" w:space="0" w:color="334047"/>
-              <w:left w:val="single" w:sz="6" w:space="0" w:color="334047"/>
-              <w:right w:val="single" w:sz="6" w:space="0" w:color="334047"/>
-            </w:tcBorders>
-            <w:shd w:val="clear" w:color="auto" w:fill="F8E4F5"/>
-          </w:tcPr>
-          <w:p>
-            <w:pPr>
-              <w:pStyle w:val="NormalWeb"/>
-              <w:spacing w:before="0" w:beforeAutospacing="0" w:after="240" w:afterAutospacing="0"/>
-              <w:ind w:left="115"/>
-              <w:textAlignment w:val="baseline"/>
-              <w:rPr>
-                <w:rFonts w:asciiTheme="minorHAnsi" w:hAnsiTheme="minorHAnsi" w:cs="Open Sans"/>
-                <w:color w:val="000000"/>
-                <w:sz w:val="18"/>
-                <w:szCs w:val="18"/>
-              </w:rPr>
-            </w:pPr>
-            <w:r>
-              <w:rPr>
-                <w:rFonts w:ascii="Calibri" w:hAnsi="Calibri" w:cs="Calibri"/>
-                <w:sz w:val="18"/>
-                <w:szCs w:val="18"/>
-              </w:rPr>
-              <w:t xml:space="preserve">Compares and contrasts the implementation of their software engineering solution with alternative approaches. </w:t>
-            </w:r>
-            <w:r>
-              <w:rPr>
-                <w:rFonts w:ascii="Calibri" w:hAnsi="Calibri" w:cs="Calibri"/>
-                <w:b/>
-                <w:bCs/>
-                <w:color w:val="EE0000"/>
-                <w:sz w:val="18"/>
-                <w:szCs w:val="18"/>
-              </w:rPr>
-              <w:t>(S22/SES7)</w:t>
-            </w:r>
-            <w:r>
-              <w:rPr>
-                <w:rFonts w:ascii="Calibri" w:hAnsi="Calibri" w:cs="Calibri"/>
-                <w:color w:val="EE0000"/>
-                <w:sz w:val="18"/>
-                <w:szCs w:val="18"/>
-              </w:rPr>
-              <w:t>   </w:t>
-            </w:r>
-          </w:p>
-        </w:tc>
-      </w:tr>
-      <w:tr>
-        <w:tc>
-          <w:tcPr>
-            <w:tcW w:w="1805" w:type="dxa"/>
-            <w:tcBorders>
-              <w:top w:val="single" w:sz="6" w:space="0" w:color="334047"/>
-              <w:left w:val="single" w:sz="6" w:space="0" w:color="334047"/>
-              <w:bottom w:val="single" w:sz="6" w:space="0" w:color="334047"/>
-              <w:right w:val="single" w:sz="6" w:space="0" w:color="334047"/>
-            </w:tcBorders>
-            <w:shd w:val="clear" w:color="auto" w:fill="F8E4F5"/>
-            <w:tcMar>
-              <w:top w:w="75" w:type="dxa"/>
-              <w:left w:w="150" w:type="dxa"/>
-              <w:bottom w:w="75" w:type="dxa"/>
-              <w:right w:w="150" w:type="dxa"/>
-            </w:tcMar>
-          </w:tcPr>
-          <w:p>
-            <w:pPr>
-              <w:jc w:val="center"/>
-              <w:rPr>
-                <w:b/>
-                <w:bCs/>
-              </w:rPr>
-            </w:pPr>
-            <w:r>
-              <w:rPr>
-                <w:b/>
-                <w:bCs/>
-              </w:rPr>
-              <w:t>S16</w:t>
-            </w:r>
-          </w:p>
-        </w:tc>
-        <w:tc>
-          <w:tcPr>
-            <w:tcW w:w="1805" w:type="dxa"/>
-            <w:gridSpan w:val="2"/>
-            <w:tcBorders>
-              <w:top w:val="single" w:sz="6" w:space="0" w:color="334047"/>
-              <w:left w:val="single" w:sz="6" w:space="0" w:color="334047"/>
-              <w:bottom w:val="single" w:sz="6" w:space="0" w:color="334047"/>
-              <w:right w:val="single" w:sz="6" w:space="0" w:color="334047"/>
-            </w:tcBorders>
-            <w:shd w:val="clear" w:color="auto" w:fill="F8E4F5"/>
-          </w:tcPr>
-          <w:p>
-            <w:pPr>
-              <w:jc w:val="center"/>
-              <w:rPr>
-                <w:b/>
-                <w:bCs/>
-              </w:rPr>
-            </w:pPr>
-            <w:r>
-              <w:rPr>
-                <w:b/>
-                <w:bCs/>
-              </w:rPr>
-              <w:t>S17</w:t>
-            </w:r>
-          </w:p>
-        </w:tc>
-        <w:tc>
-          <w:tcPr>
-            <w:tcW w:w="1805" w:type="dxa"/>
-            <w:tcBorders>
-              <w:top w:val="single" w:sz="6" w:space="0" w:color="334047"/>
-              <w:left w:val="single" w:sz="6" w:space="0" w:color="334047"/>
-              <w:bottom w:val="single" w:sz="6" w:space="0" w:color="334047"/>
-              <w:right w:val="single" w:sz="6" w:space="0" w:color="334047"/>
-            </w:tcBorders>
-            <w:shd w:val="clear" w:color="auto" w:fill="F8E4F5"/>
-          </w:tcPr>
-          <w:p>
-            <w:pPr>
-              <w:jc w:val="center"/>
-              <w:rPr>
-                <w:b/>
-                <w:bCs/>
-              </w:rPr>
-            </w:pPr>
-            <w:r>
-              <w:rPr>
-                <w:b/>
-                <w:bCs/>
-              </w:rPr>
-              <w:t>S18</w:t>
-            </w:r>
-          </w:p>
-        </w:tc>
-        <w:tc>
-          <w:tcPr>
-            <w:tcW w:w="1805" w:type="dxa"/>
-            <w:gridSpan w:val="2"/>
-            <w:tcBorders>
-              <w:top w:val="single" w:sz="6" w:space="0" w:color="334047"/>
-              <w:left w:val="single" w:sz="6" w:space="0" w:color="334047"/>
-              <w:bottom w:val="single" w:sz="6" w:space="0" w:color="334047"/>
-              <w:right w:val="single" w:sz="6" w:space="0" w:color="334047"/>
-            </w:tcBorders>
-            <w:shd w:val="clear" w:color="auto" w:fill="F8E4F5"/>
-          </w:tcPr>
-          <w:p>
-            <w:pPr>
-              <w:jc w:val="center"/>
-              <w:rPr>
-                <w:b/>
-                <w:bCs/>
-              </w:rPr>
-            </w:pPr>
-            <w:r>
-              <w:rPr>
-                <w:b/>
-                <w:bCs/>
-              </w:rPr>
-              <w:t>A19</w:t>
-            </w:r>
-          </w:p>
-        </w:tc>
-        <w:tc>
-          <w:tcPr>
-            <w:tcW w:w="1805" w:type="dxa"/>
-            <w:tcBorders>
-              <w:top w:val="single" w:sz="6" w:space="0" w:color="334047"/>
-              <w:left w:val="single" w:sz="6" w:space="0" w:color="334047"/>
-              <w:bottom w:val="single" w:sz="6" w:space="0" w:color="334047"/>
-              <w:right w:val="single" w:sz="6" w:space="0" w:color="334047"/>
-            </w:tcBorders>
-            <w:shd w:val="clear" w:color="auto" w:fill="F8E4F5"/>
-          </w:tcPr>
-          <w:p>
-            <w:pPr>
-              <w:jc w:val="center"/>
-              <w:rPr>
-                <w:b/>
-                <w:bCs/>
-              </w:rPr>
-            </w:pPr>
-            <w:r>
-              <w:rPr>
-                <w:b/>
-                <w:bCs/>
-              </w:rPr>
-              <w:t>S22</w:t>
-            </w:r>
-          </w:p>
-        </w:tc>
-        <w:tc>
-          <w:tcPr>
-            <w:tcW w:w="1805" w:type="dxa"/>
-            <w:tcBorders>
-              <w:top w:val="single" w:sz="6" w:space="0" w:color="334047"/>
-              <w:left w:val="single" w:sz="6" w:space="0" w:color="334047"/>
-              <w:bottom w:val="single" w:sz="6" w:space="0" w:color="334047"/>
-              <w:right w:val="single" w:sz="6" w:space="0" w:color="334047"/>
-            </w:tcBorders>
-            <w:shd w:val="clear" w:color="auto" w:fill="F8E4F5"/>
-          </w:tcPr>
-          <w:p>
-            <w:pPr>
-              <w:jc w:val="center"/>
-              <w:rPr>
-                <w:b/>
-                <w:bCs/>
-              </w:rPr>
-            </w:pPr>
-          </w:p>
-        </w:tc>
-      </w:tr>
-    </w:tbl>
-    <w:p/>
-    <w:p/>
-    <w:tbl>
-      <w:tblPr>
-        <w:tblW w:w="10830" w:type="dxa"/>
-        <w:tblBorders>
-          <w:top w:val="single" w:sz="12" w:space="0" w:color="774B99"/>
-          <w:left w:val="single" w:sz="12" w:space="0" w:color="774B99"/>
-          <w:bottom w:val="single" w:sz="12" w:space="0" w:color="774B99"/>
-          <w:right w:val="single" w:sz="12" w:space="0" w:color="774B99"/>
-        </w:tblBorders>
-        <w:shd w:val="clear" w:color="auto" w:fill="F8E4F5"/>
-        <w:tblCellMar>
-          <w:left w:w="0" w:type="dxa"/>
-          <w:right w:w="0" w:type="dxa"/>
-        </w:tblCellMar>
-        <w:tblLook w:val="04A0" w:firstRow="1" w:lastRow="0" w:firstColumn="1" w:lastColumn="0" w:noHBand="0" w:noVBand="1"/>
-      </w:tblPr>
-      <w:tblGrid>
-        <w:gridCol w:w="1805"/>
-        <w:gridCol w:w="716"/>
-        <w:gridCol w:w="1089"/>
-        <w:gridCol w:w="1805"/>
-        <w:gridCol w:w="1260"/>
-        <w:gridCol w:w="545"/>
-        <w:gridCol w:w="1805"/>
-        <w:gridCol w:w="1805"/>
-      </w:tblGrid>
-      <w:tr>
-        <w:trPr>
-          <w:trHeight w:val="259"/>
-        </w:trPr>
-        <w:tc>
-          <w:tcPr>
-            <w:tcW w:w="10830" w:type="dxa"/>
-            <w:gridSpan w:val="8"/>
-            <w:tcBorders>
-              <w:top w:val="single" w:sz="6" w:space="0" w:color="334047"/>
-              <w:left w:val="single" w:sz="6" w:space="0" w:color="334047"/>
-              <w:bottom w:val="single" w:sz="6" w:space="0" w:color="334047"/>
-              <w:right w:val="single" w:sz="6" w:space="0" w:color="334047"/>
-            </w:tcBorders>
-            <w:shd w:val="clear" w:color="auto" w:fill="F8E4F5"/>
-            <w:tcMar>
-              <w:top w:w="75" w:type="dxa"/>
-              <w:left w:w="150" w:type="dxa"/>
-              <w:bottom w:w="75" w:type="dxa"/>
-              <w:right w:w="150" w:type="dxa"/>
-            </w:tcMar>
-          </w:tcPr>
-          <w:p>
             <w:r>
               <w:rPr>
                 <w:rFonts w:eastAsia="Times New Roman" w:cs="Segoe UI"/>
@@ -23503,30 +22668,7 @@
                 <w:lang w:eastAsia="en-GB"/>
                 <w14:ligatures w14:val="none"/>
               </w:rPr>
-              <w:lastRenderedPageBreak/>
-              <w:t>Theme C: Innovation &amp; Response</w:t>
-            </w:r>
-            <w:r>
-              <w:rPr>
-                <w:rFonts w:eastAsia="Times New Roman" w:cs="Segoe UI"/>
-                <w:b/>
-                <w:bCs/>
-                <w:kern w:val="0"/>
-                <w:lang w:eastAsia="en-GB"/>
-                <w14:ligatures w14:val="none"/>
-              </w:rPr>
-              <w:t xml:space="preserve"> </w:t>
-            </w:r>
-            <w:r>
-              <w:rPr>
-                <w:rFonts w:eastAsia="Times New Roman" w:cs="Segoe UI"/>
-                <w:b/>
-                <w:bCs/>
-                <w:kern w:val="0"/>
-                <w:lang w:eastAsia="en-GB"/>
-                <w14:ligatures w14:val="none"/>
-              </w:rPr>
-              <w:t>2</w:t>
+              <w:t>1</w:t>
             </w:r>
           </w:p>
         </w:tc>
@@ -23841,6 +22983,915 @@
         </w:tc>
       </w:tr>
     </w:tbl>
+    <w:p>
+      <w:pPr>
+        <w:rPr>
+          <w:sz w:val="16"/>
+          <w:szCs w:val="16"/>
+        </w:rPr>
+      </w:pPr>
+    </w:p>
+    <w:p>
+      <w:pPr>
+        <w:rPr>
+          <w:sz w:val="16"/>
+          <w:szCs w:val="16"/>
+        </w:rPr>
+      </w:pPr>
+    </w:p>
+    <w:tbl>
+      <w:tblPr>
+        <w:tblW w:w="10830" w:type="dxa"/>
+        <w:tblBorders>
+          <w:top w:val="single" w:sz="12" w:space="0" w:color="774B99"/>
+          <w:left w:val="single" w:sz="12" w:space="0" w:color="774B99"/>
+          <w:bottom w:val="single" w:sz="12" w:space="0" w:color="774B99"/>
+          <w:right w:val="single" w:sz="12" w:space="0" w:color="774B99"/>
+        </w:tblBorders>
+        <w:shd w:val="clear" w:color="auto" w:fill="F8E4F5"/>
+        <w:tblCellMar>
+          <w:left w:w="0" w:type="dxa"/>
+          <w:right w:w="0" w:type="dxa"/>
+        </w:tblCellMar>
+        <w:tblLook w:val="04A0" w:firstRow="1" w:lastRow="0" w:firstColumn="1" w:lastColumn="0" w:noHBand="0" w:noVBand="1"/>
+      </w:tblPr>
+      <w:tblGrid>
+        <w:gridCol w:w="1805"/>
+        <w:gridCol w:w="716"/>
+        <w:gridCol w:w="1089"/>
+        <w:gridCol w:w="1805"/>
+        <w:gridCol w:w="1260"/>
+        <w:gridCol w:w="545"/>
+        <w:gridCol w:w="1805"/>
+        <w:gridCol w:w="1805"/>
+      </w:tblGrid>
+      <w:tr>
+        <w:trPr>
+          <w:trHeight w:val="259"/>
+        </w:trPr>
+        <w:tc>
+          <w:tcPr>
+            <w:tcW w:w="10830" w:type="dxa"/>
+            <w:gridSpan w:val="8"/>
+            <w:tcBorders>
+              <w:top w:val="single" w:sz="6" w:space="0" w:color="334047"/>
+              <w:left w:val="single" w:sz="6" w:space="0" w:color="334047"/>
+              <w:bottom w:val="single" w:sz="6" w:space="0" w:color="334047"/>
+              <w:right w:val="single" w:sz="6" w:space="0" w:color="334047"/>
+            </w:tcBorders>
+            <w:shd w:val="clear" w:color="auto" w:fill="F8E4F5"/>
+            <w:tcMar>
+              <w:top w:w="75" w:type="dxa"/>
+              <w:left w:w="150" w:type="dxa"/>
+              <w:bottom w:w="75" w:type="dxa"/>
+              <w:right w:w="150" w:type="dxa"/>
+            </w:tcMar>
+          </w:tcPr>
+          <w:p>
+            <w:r>
+              <w:rPr>
+                <w:rFonts w:eastAsia="Times New Roman" w:cs="Segoe UI"/>
+                <w:b/>
+                <w:bCs/>
+                <w:kern w:val="0"/>
+                <w:lang w:eastAsia="en-GB"/>
+                <w14:ligatures w14:val="none"/>
+              </w:rPr>
+              <w:t>Theme C: Innovation &amp; Response</w:t>
+            </w:r>
+            <w:r>
+              <w:rPr>
+                <w:rFonts w:eastAsia="Times New Roman" w:cs="Segoe UI"/>
+                <w:b/>
+                <w:bCs/>
+                <w:kern w:val="0"/>
+                <w:lang w:eastAsia="en-GB"/>
+                <w14:ligatures w14:val="none"/>
+              </w:rPr>
+              <w:t xml:space="preserve"> </w:t>
+            </w:r>
+            <w:r>
+              <w:rPr>
+                <w:rFonts w:eastAsia="Times New Roman" w:cs="Segoe UI"/>
+                <w:b/>
+                <w:bCs/>
+                <w:kern w:val="0"/>
+                <w:lang w:eastAsia="en-GB"/>
+                <w14:ligatures w14:val="none"/>
+              </w:rPr>
+              <w:t>2</w:t>
+            </w:r>
+          </w:p>
+        </w:tc>
+      </w:tr>
+      <w:tr>
+        <w:trPr>
+          <w:trHeight w:val="1851"/>
+        </w:trPr>
+        <w:tc>
+          <w:tcPr>
+            <w:tcW w:w="2521" w:type="dxa"/>
+            <w:gridSpan w:val="2"/>
+            <w:vMerge w:val="restart"/>
+            <w:tcBorders>
+              <w:top w:val="single" w:sz="6" w:space="0" w:color="334047"/>
+              <w:left w:val="single" w:sz="6" w:space="0" w:color="334047"/>
+              <w:right w:val="single" w:sz="6" w:space="0" w:color="334047"/>
+            </w:tcBorders>
+            <w:shd w:val="clear" w:color="auto" w:fill="F8E4F5"/>
+            <w:tcMar>
+              <w:top w:w="75" w:type="dxa"/>
+              <w:left w:w="150" w:type="dxa"/>
+              <w:bottom w:w="75" w:type="dxa"/>
+              <w:right w:w="150" w:type="dxa"/>
+            </w:tcMar>
+            <w:hideMark/>
+          </w:tcPr>
+          <w:p>
+            <w:pPr>
+              <w:rPr>
+                <w:sz w:val="18"/>
+                <w:szCs w:val="18"/>
+              </w:rPr>
+            </w:pPr>
+            <w:r>
+              <w:rPr>
+                <w:rFonts w:ascii="Calibri" w:hAnsi="Calibri" w:cs="Calibri"/>
+                <w:sz w:val="18"/>
+                <w:szCs w:val="18"/>
+              </w:rPr>
+              <w:t xml:space="preserve">Software Engineer </w:t>
+            </w:r>
+            <w:r>
+              <w:rPr>
+                <w:rFonts w:ascii="Calibri" w:hAnsi="Calibri" w:cs="Calibri"/>
+                <w:sz w:val="18"/>
+                <w:szCs w:val="18"/>
+              </w:rPr>
+              <w:t xml:space="preserve">- </w:t>
+            </w:r>
+            <w:r>
+              <w:rPr>
+                <w:rFonts w:ascii="Calibri" w:hAnsi="Calibri" w:cs="Calibri"/>
+                <w:sz w:val="18"/>
+                <w:szCs w:val="18"/>
+              </w:rPr>
+              <w:t>Innovation and Response </w:t>
+            </w:r>
+            <w:r>
+              <w:rPr>
+                <w:rFonts w:ascii="Calibri" w:hAnsi="Calibri" w:cs="Calibri"/>
+                <w:sz w:val="18"/>
+                <w:szCs w:val="18"/>
+              </w:rPr>
+              <w:br/>
+            </w:r>
+            <w:r>
+              <w:rPr>
+                <w:rFonts w:ascii="Calibri" w:hAnsi="Calibri" w:cs="Calibri"/>
+                <w:b/>
+                <w:bCs/>
+                <w:sz w:val="18"/>
+                <w:szCs w:val="18"/>
+              </w:rPr>
+              <w:t>(Theme C)</w:t>
+            </w:r>
+            <w:r>
+              <w:rPr>
+                <w:rFonts w:ascii="Calibri" w:hAnsi="Calibri" w:cs="Calibri"/>
+                <w:sz w:val="18"/>
+                <w:szCs w:val="18"/>
+              </w:rPr>
+              <w:t xml:space="preserve"> </w:t>
+            </w:r>
+            <w:r>
+              <w:rPr>
+                <w:rFonts w:ascii="Calibri" w:hAnsi="Calibri" w:cs="Calibri"/>
+                <w:sz w:val="18"/>
+                <w:szCs w:val="18"/>
+              </w:rPr>
+              <w:br/>
+            </w:r>
+            <w:r>
+              <w:rPr>
+                <w:rFonts w:ascii="Calibri" w:hAnsi="Calibri" w:cs="Calibri"/>
+                <w:b/>
+                <w:bCs/>
+                <w:color w:val="EE0000"/>
+                <w:sz w:val="18"/>
+                <w:szCs w:val="18"/>
+              </w:rPr>
+              <w:t>S16 S17 S18 S19 S22</w:t>
+            </w:r>
+          </w:p>
+        </w:tc>
+        <w:tc>
+          <w:tcPr>
+            <w:tcW w:w="4154" w:type="dxa"/>
+            <w:gridSpan w:val="3"/>
+            <w:tcBorders>
+              <w:top w:val="single" w:sz="6" w:space="0" w:color="334047"/>
+              <w:left w:val="single" w:sz="6" w:space="0" w:color="334047"/>
+              <w:bottom w:val="single" w:sz="6" w:space="0" w:color="334047"/>
+              <w:right w:val="single" w:sz="6" w:space="0" w:color="334047"/>
+            </w:tcBorders>
+            <w:shd w:val="clear" w:color="auto" w:fill="F8E4F5"/>
+            <w:tcMar>
+              <w:top w:w="75" w:type="dxa"/>
+              <w:left w:w="150" w:type="dxa"/>
+              <w:bottom w:w="75" w:type="dxa"/>
+              <w:right w:w="150" w:type="dxa"/>
+            </w:tcMar>
+            <w:hideMark/>
+          </w:tcPr>
+          <w:p>
+            <w:pPr>
+              <w:spacing w:after="160" w:line="278" w:lineRule="auto"/>
+              <w:rPr>
+                <w:rFonts w:ascii="Calibri" w:hAnsi="Calibri" w:cs="Calibri"/>
+                <w:sz w:val="18"/>
+                <w:szCs w:val="18"/>
+              </w:rPr>
+            </w:pPr>
+            <w:r>
+              <w:rPr>
+                <w:rFonts w:ascii="Calibri" w:hAnsi="Calibri" w:cs="Calibri"/>
+                <w:sz w:val="18"/>
+                <w:szCs w:val="18"/>
+              </w:rPr>
+              <w:t xml:space="preserve">Identifies and defines a non-routine, unspecified software engineering problem. </w:t>
+            </w:r>
+            <w:r>
+              <w:rPr>
+                <w:rFonts w:ascii="Calibri" w:hAnsi="Calibri" w:cs="Calibri"/>
+                <w:b/>
+                <w:bCs/>
+                <w:color w:val="EE0000"/>
+                <w:sz w:val="18"/>
+                <w:szCs w:val="18"/>
+              </w:rPr>
+              <w:t>(S16/SES1)</w:t>
+            </w:r>
+            <w:r>
+              <w:rPr>
+                <w:rFonts w:ascii="Calibri" w:hAnsi="Calibri" w:cs="Calibri"/>
+                <w:color w:val="EE0000"/>
+                <w:sz w:val="18"/>
+                <w:szCs w:val="18"/>
+              </w:rPr>
+              <w:t xml:space="preserve">  </w:t>
+            </w:r>
+          </w:p>
+          <w:p>
+            <w:pPr>
+              <w:pStyle w:val="NormalWeb"/>
+              <w:spacing w:before="0" w:beforeAutospacing="0" w:after="240" w:afterAutospacing="0"/>
+              <w:ind w:left="-27"/>
+              <w:textAlignment w:val="baseline"/>
+              <w:rPr>
+                <w:rFonts w:asciiTheme="minorHAnsi" w:hAnsiTheme="minorHAnsi" w:cs="Open Sans"/>
+                <w:color w:val="EE0000"/>
+                <w:sz w:val="18"/>
+                <w:szCs w:val="18"/>
+              </w:rPr>
+            </w:pPr>
+            <w:r>
+              <w:rPr>
+                <w:rFonts w:ascii="Calibri" w:hAnsi="Calibri" w:cs="Calibri"/>
+                <w:sz w:val="18"/>
+                <w:szCs w:val="18"/>
+              </w:rPr>
+              <w:t>Evaluates their selection of approach, methodology, analysis and outcomes to identify both lessons learned and recommendations for improvements to future projects software engineering projects</w:t>
+            </w:r>
+            <w:r>
+              <w:rPr>
+                <w:rFonts w:ascii="Calibri" w:hAnsi="Calibri" w:cs="Calibri"/>
+                <w:b/>
+                <w:bCs/>
+                <w:color w:val="EE0000"/>
+                <w:sz w:val="18"/>
+                <w:szCs w:val="18"/>
+              </w:rPr>
+              <w:t>. (S22/SES7)</w:t>
+            </w:r>
+          </w:p>
+        </w:tc>
+        <w:tc>
+          <w:tcPr>
+            <w:tcW w:w="4155" w:type="dxa"/>
+            <w:gridSpan w:val="3"/>
+            <w:tcBorders>
+              <w:top w:val="single" w:sz="6" w:space="0" w:color="334047"/>
+              <w:left w:val="single" w:sz="6" w:space="0" w:color="334047"/>
+              <w:bottom w:val="single" w:sz="6" w:space="0" w:color="334047"/>
+              <w:right w:val="single" w:sz="6" w:space="0" w:color="334047"/>
+            </w:tcBorders>
+            <w:shd w:val="clear" w:color="auto" w:fill="F8E4F5"/>
+          </w:tcPr>
+          <w:p>
+            <w:pPr>
+              <w:spacing w:after="160" w:line="278" w:lineRule="auto"/>
+              <w:rPr>
+                <w:rFonts w:cs="Open Sans"/>
+                <w:color w:val="EE0000"/>
+                <w:sz w:val="18"/>
+                <w:szCs w:val="18"/>
+              </w:rPr>
+            </w:pPr>
+          </w:p>
+        </w:tc>
+      </w:tr>
+      <w:tr>
+        <w:trPr>
+          <w:trHeight w:val="691"/>
+        </w:trPr>
+        <w:tc>
+          <w:tcPr>
+            <w:tcW w:w="2521" w:type="dxa"/>
+            <w:gridSpan w:val="2"/>
+            <w:vMerge/>
+            <w:tcBorders>
+              <w:left w:val="single" w:sz="6" w:space="0" w:color="334047"/>
+              <w:right w:val="single" w:sz="6" w:space="0" w:color="334047"/>
+            </w:tcBorders>
+            <w:shd w:val="clear" w:color="auto" w:fill="F8E4F5"/>
+            <w:tcMar>
+              <w:top w:w="75" w:type="dxa"/>
+              <w:left w:w="150" w:type="dxa"/>
+              <w:bottom w:w="75" w:type="dxa"/>
+              <w:right w:w="150" w:type="dxa"/>
+            </w:tcMar>
+          </w:tcPr>
+          <w:p>
+            <w:pPr>
+              <w:rPr>
+                <w:sz w:val="18"/>
+                <w:szCs w:val="18"/>
+              </w:rPr>
+            </w:pPr>
+          </w:p>
+        </w:tc>
+        <w:tc>
+          <w:tcPr>
+            <w:tcW w:w="4154" w:type="dxa"/>
+            <w:gridSpan w:val="3"/>
+            <w:tcBorders>
+              <w:top w:val="single" w:sz="6" w:space="0" w:color="334047"/>
+              <w:left w:val="single" w:sz="6" w:space="0" w:color="334047"/>
+              <w:bottom w:val="single" w:sz="6" w:space="0" w:color="334047"/>
+              <w:right w:val="single" w:sz="6" w:space="0" w:color="334047"/>
+            </w:tcBorders>
+            <w:shd w:val="clear" w:color="auto" w:fill="F8E4F5"/>
+            <w:tcMar>
+              <w:top w:w="75" w:type="dxa"/>
+              <w:left w:w="150" w:type="dxa"/>
+              <w:bottom w:w="75" w:type="dxa"/>
+              <w:right w:w="150" w:type="dxa"/>
+            </w:tcMar>
+          </w:tcPr>
+          <w:p>
+            <w:pPr>
+              <w:spacing w:after="160" w:line="278" w:lineRule="auto"/>
+              <w:rPr>
+                <w:rFonts w:ascii="Calibri" w:hAnsi="Calibri" w:cs="Calibri"/>
+                <w:b/>
+                <w:bCs/>
+                <w:color w:val="EE0000"/>
+                <w:sz w:val="18"/>
+                <w:szCs w:val="18"/>
+              </w:rPr>
+            </w:pPr>
+            <w:r>
+              <w:rPr>
+                <w:rFonts w:ascii="Calibri" w:hAnsi="Calibri" w:cs="Calibri"/>
+                <w:sz w:val="18"/>
+                <w:szCs w:val="18"/>
+              </w:rPr>
+              <w:t>Recommends a software engineering solution that is appropriate for the project brief</w:t>
+            </w:r>
+            <w:r>
+              <w:rPr>
+                <w:rFonts w:ascii="Calibri" w:hAnsi="Calibri" w:cs="Calibri"/>
+                <w:b/>
+                <w:bCs/>
+                <w:color w:val="EE0000"/>
+                <w:sz w:val="18"/>
+                <w:szCs w:val="18"/>
+              </w:rPr>
+              <w:t>. (S17/SES2)</w:t>
+            </w:r>
+          </w:p>
+        </w:tc>
+        <w:tc>
+          <w:tcPr>
+            <w:tcW w:w="4155" w:type="dxa"/>
+            <w:gridSpan w:val="3"/>
+            <w:tcBorders>
+              <w:top w:val="single" w:sz="6" w:space="0" w:color="334047"/>
+              <w:left w:val="single" w:sz="6" w:space="0" w:color="334047"/>
+              <w:bottom w:val="single" w:sz="6" w:space="0" w:color="334047"/>
+              <w:right w:val="single" w:sz="6" w:space="0" w:color="334047"/>
+            </w:tcBorders>
+            <w:shd w:val="clear" w:color="auto" w:fill="F8E4F5"/>
+          </w:tcPr>
+          <w:p>
+            <w:pPr>
+              <w:spacing w:after="160" w:line="278" w:lineRule="auto"/>
+              <w:ind w:left="115"/>
+              <w:rPr>
+                <w:rFonts w:ascii="Calibri" w:hAnsi="Calibri" w:cs="Calibri"/>
+                <w:sz w:val="18"/>
+                <w:szCs w:val="18"/>
+              </w:rPr>
+            </w:pPr>
+            <w:r>
+              <w:rPr>
+                <w:rFonts w:ascii="Calibri" w:hAnsi="Calibri" w:cs="Calibri"/>
+                <w:sz w:val="18"/>
+                <w:szCs w:val="18"/>
+              </w:rPr>
+              <w:t xml:space="preserve">Evaluates their choice of software engineering solution for the project brief. </w:t>
+            </w:r>
+            <w:r>
+              <w:rPr>
+                <w:rFonts w:ascii="Calibri" w:hAnsi="Calibri" w:cs="Calibri"/>
+                <w:b/>
+                <w:bCs/>
+                <w:color w:val="EE0000"/>
+                <w:sz w:val="18"/>
+                <w:szCs w:val="18"/>
+              </w:rPr>
+              <w:t>(S17/SES2)</w:t>
+            </w:r>
+            <w:r>
+              <w:rPr>
+                <w:rFonts w:ascii="Calibri" w:hAnsi="Calibri" w:cs="Calibri"/>
+                <w:color w:val="EE0000"/>
+                <w:sz w:val="18"/>
+                <w:szCs w:val="18"/>
+              </w:rPr>
+              <w:t> </w:t>
+            </w:r>
+          </w:p>
+        </w:tc>
+      </w:tr>
+      <w:tr>
+        <w:tc>
+          <w:tcPr>
+            <w:tcW w:w="2521" w:type="dxa"/>
+            <w:gridSpan w:val="2"/>
+            <w:vMerge/>
+            <w:tcBorders>
+              <w:left w:val="single" w:sz="6" w:space="0" w:color="334047"/>
+              <w:right w:val="single" w:sz="6" w:space="0" w:color="334047"/>
+            </w:tcBorders>
+            <w:shd w:val="clear" w:color="auto" w:fill="F8E4F5"/>
+            <w:tcMar>
+              <w:top w:w="75" w:type="dxa"/>
+              <w:left w:w="150" w:type="dxa"/>
+              <w:bottom w:w="75" w:type="dxa"/>
+              <w:right w:w="150" w:type="dxa"/>
+            </w:tcMar>
+          </w:tcPr>
+          <w:p>
+            <w:pPr>
+              <w:rPr>
+                <w:sz w:val="18"/>
+                <w:szCs w:val="18"/>
+              </w:rPr>
+            </w:pPr>
+          </w:p>
+        </w:tc>
+        <w:tc>
+          <w:tcPr>
+            <w:tcW w:w="4154" w:type="dxa"/>
+            <w:gridSpan w:val="3"/>
+            <w:tcBorders>
+              <w:top w:val="single" w:sz="6" w:space="0" w:color="334047"/>
+              <w:left w:val="single" w:sz="6" w:space="0" w:color="334047"/>
+              <w:bottom w:val="single" w:sz="6" w:space="0" w:color="334047"/>
+              <w:right w:val="single" w:sz="6" w:space="0" w:color="334047"/>
+            </w:tcBorders>
+            <w:shd w:val="clear" w:color="auto" w:fill="F8E4F5"/>
+            <w:tcMar>
+              <w:top w:w="75" w:type="dxa"/>
+              <w:left w:w="150" w:type="dxa"/>
+              <w:bottom w:w="75" w:type="dxa"/>
+              <w:right w:w="150" w:type="dxa"/>
+            </w:tcMar>
+          </w:tcPr>
+          <w:p>
+            <w:pPr>
+              <w:spacing w:after="160" w:line="278" w:lineRule="auto"/>
+              <w:rPr>
+                <w:rFonts w:ascii="Calibri" w:hAnsi="Calibri" w:cs="Calibri"/>
+                <w:sz w:val="18"/>
+                <w:szCs w:val="18"/>
+              </w:rPr>
+            </w:pPr>
+            <w:r>
+              <w:rPr>
+                <w:rFonts w:ascii="Calibri" w:hAnsi="Calibri" w:cs="Calibri"/>
+                <w:sz w:val="18"/>
+                <w:szCs w:val="18"/>
+              </w:rPr>
+              <w:t xml:space="preserve">Selects and applies analysis methods, approaches and techniques in software engineering projects to deliver an outcome that meets requirements. </w:t>
+            </w:r>
+            <w:r>
+              <w:rPr>
+                <w:rFonts w:ascii="Calibri" w:hAnsi="Calibri" w:cs="Calibri"/>
+                <w:b/>
+                <w:bCs/>
+                <w:color w:val="EE0000"/>
+                <w:sz w:val="18"/>
+                <w:szCs w:val="18"/>
+              </w:rPr>
+              <w:t>(S18/SES3)</w:t>
+            </w:r>
+            <w:r>
+              <w:rPr>
+                <w:rFonts w:ascii="Calibri" w:hAnsi="Calibri" w:cs="Calibri"/>
+                <w:color w:val="EE0000"/>
+                <w:sz w:val="18"/>
+                <w:szCs w:val="18"/>
+              </w:rPr>
+              <w:t> </w:t>
+            </w:r>
+          </w:p>
+        </w:tc>
+        <w:tc>
+          <w:tcPr>
+            <w:tcW w:w="4155" w:type="dxa"/>
+            <w:gridSpan w:val="3"/>
+            <w:tcBorders>
+              <w:top w:val="single" w:sz="6" w:space="0" w:color="334047"/>
+              <w:left w:val="single" w:sz="6" w:space="0" w:color="334047"/>
+              <w:bottom w:val="single" w:sz="6" w:space="0" w:color="334047"/>
+              <w:right w:val="single" w:sz="6" w:space="0" w:color="334047"/>
+            </w:tcBorders>
+            <w:shd w:val="clear" w:color="auto" w:fill="F8E4F5"/>
+          </w:tcPr>
+          <w:p>
+            <w:pPr>
+              <w:spacing w:after="160" w:line="278" w:lineRule="auto"/>
+              <w:ind w:left="115"/>
+              <w:rPr>
+                <w:rFonts w:ascii="Calibri" w:hAnsi="Calibri" w:cs="Calibri"/>
+                <w:sz w:val="18"/>
+                <w:szCs w:val="18"/>
+              </w:rPr>
+            </w:pPr>
+            <w:r>
+              <w:rPr>
+                <w:rFonts w:ascii="Calibri" w:hAnsi="Calibri" w:cs="Calibri"/>
+                <w:sz w:val="18"/>
+                <w:szCs w:val="18"/>
+              </w:rPr>
+              <w:t>Justifies their choice of analysis methods approaches and techniques</w:t>
+            </w:r>
+            <w:r>
+              <w:rPr>
+                <w:rFonts w:ascii="Calibri" w:hAnsi="Calibri" w:cs="Calibri"/>
+                <w:color w:val="EE0000"/>
+                <w:sz w:val="18"/>
+                <w:szCs w:val="18"/>
+              </w:rPr>
+              <w:t xml:space="preserve">. </w:t>
+            </w:r>
+            <w:r>
+              <w:rPr>
+                <w:rFonts w:ascii="Calibri" w:hAnsi="Calibri" w:cs="Calibri"/>
+                <w:b/>
+                <w:bCs/>
+                <w:color w:val="EE0000"/>
+                <w:sz w:val="18"/>
+                <w:szCs w:val="18"/>
+              </w:rPr>
+              <w:t>(S18/SE3)</w:t>
+            </w:r>
+          </w:p>
+          <w:p>
+            <w:pPr>
+              <w:pStyle w:val="NormalWeb"/>
+              <w:spacing w:before="0" w:beforeAutospacing="0" w:after="240" w:afterAutospacing="0"/>
+              <w:ind w:left="115"/>
+              <w:textAlignment w:val="baseline"/>
+              <w:rPr>
+                <w:rFonts w:asciiTheme="minorHAnsi" w:hAnsiTheme="minorHAnsi" w:cs="Open Sans"/>
+                <w:color w:val="000000"/>
+                <w:sz w:val="18"/>
+                <w:szCs w:val="18"/>
+              </w:rPr>
+            </w:pPr>
+          </w:p>
+        </w:tc>
+      </w:tr>
+      <w:tr>
+        <w:trPr>
+          <w:trHeight w:val="1219"/>
+        </w:trPr>
+        <w:tc>
+          <w:tcPr>
+            <w:tcW w:w="2521" w:type="dxa"/>
+            <w:gridSpan w:val="2"/>
+            <w:vMerge/>
+            <w:tcBorders>
+              <w:left w:val="single" w:sz="6" w:space="0" w:color="334047"/>
+              <w:right w:val="single" w:sz="6" w:space="0" w:color="334047"/>
+            </w:tcBorders>
+            <w:shd w:val="clear" w:color="auto" w:fill="F8E4F5"/>
+            <w:tcMar>
+              <w:top w:w="75" w:type="dxa"/>
+              <w:left w:w="150" w:type="dxa"/>
+              <w:bottom w:w="75" w:type="dxa"/>
+              <w:right w:w="150" w:type="dxa"/>
+            </w:tcMar>
+          </w:tcPr>
+          <w:p>
+            <w:pPr>
+              <w:rPr>
+                <w:sz w:val="18"/>
+                <w:szCs w:val="18"/>
+              </w:rPr>
+            </w:pPr>
+          </w:p>
+        </w:tc>
+        <w:tc>
+          <w:tcPr>
+            <w:tcW w:w="4154" w:type="dxa"/>
+            <w:gridSpan w:val="3"/>
+            <w:tcBorders>
+              <w:top w:val="single" w:sz="6" w:space="0" w:color="334047"/>
+              <w:left w:val="single" w:sz="6" w:space="0" w:color="334047"/>
+              <w:right w:val="single" w:sz="6" w:space="0" w:color="334047"/>
+            </w:tcBorders>
+            <w:shd w:val="clear" w:color="auto" w:fill="F8E4F5"/>
+            <w:tcMar>
+              <w:top w:w="75" w:type="dxa"/>
+              <w:left w:w="150" w:type="dxa"/>
+              <w:bottom w:w="75" w:type="dxa"/>
+              <w:right w:w="150" w:type="dxa"/>
+            </w:tcMar>
+          </w:tcPr>
+          <w:p>
+            <w:pPr>
+              <w:spacing w:after="160" w:line="278" w:lineRule="auto"/>
+              <w:rPr>
+                <w:rFonts w:ascii="Calibri" w:hAnsi="Calibri" w:cs="Calibri"/>
+                <w:sz w:val="18"/>
+                <w:szCs w:val="18"/>
+              </w:rPr>
+            </w:pPr>
+            <w:r>
+              <w:rPr>
+                <w:rFonts w:ascii="Calibri" w:hAnsi="Calibri" w:cs="Calibri"/>
+                <w:sz w:val="18"/>
+                <w:szCs w:val="18"/>
+              </w:rPr>
+              <w:t xml:space="preserve">Demonstrates how they implement software engineering projects using appropriate software engineering methods, approaches and techniques. </w:t>
+            </w:r>
+            <w:r>
+              <w:rPr>
+                <w:rFonts w:ascii="Calibri" w:hAnsi="Calibri" w:cs="Calibri"/>
+                <w:b/>
+                <w:bCs/>
+                <w:color w:val="EE0000"/>
+                <w:sz w:val="18"/>
+                <w:szCs w:val="18"/>
+              </w:rPr>
+              <w:t>(S19/SES4)</w:t>
+            </w:r>
+          </w:p>
+        </w:tc>
+        <w:tc>
+          <w:tcPr>
+            <w:tcW w:w="4155" w:type="dxa"/>
+            <w:gridSpan w:val="3"/>
+            <w:tcBorders>
+              <w:top w:val="single" w:sz="6" w:space="0" w:color="334047"/>
+              <w:left w:val="single" w:sz="6" w:space="0" w:color="334047"/>
+              <w:right w:val="single" w:sz="6" w:space="0" w:color="334047"/>
+            </w:tcBorders>
+            <w:shd w:val="clear" w:color="auto" w:fill="F8E4F5"/>
+          </w:tcPr>
+          <w:p>
+            <w:pPr>
+              <w:pStyle w:val="NormalWeb"/>
+              <w:spacing w:before="0" w:beforeAutospacing="0" w:after="240" w:afterAutospacing="0"/>
+              <w:ind w:left="115"/>
+              <w:textAlignment w:val="baseline"/>
+              <w:rPr>
+                <w:rFonts w:asciiTheme="minorHAnsi" w:hAnsiTheme="minorHAnsi" w:cs="Open Sans"/>
+                <w:color w:val="000000"/>
+                <w:sz w:val="18"/>
+                <w:szCs w:val="18"/>
+              </w:rPr>
+            </w:pPr>
+            <w:r>
+              <w:rPr>
+                <w:rFonts w:ascii="Calibri" w:hAnsi="Calibri" w:cs="Calibri"/>
+                <w:sz w:val="18"/>
+                <w:szCs w:val="18"/>
+              </w:rPr>
+              <w:t xml:space="preserve">Compares and contrasts the implementation of their software engineering solution with alternative approaches. </w:t>
+            </w:r>
+            <w:r>
+              <w:rPr>
+                <w:rFonts w:ascii="Calibri" w:hAnsi="Calibri" w:cs="Calibri"/>
+                <w:b/>
+                <w:bCs/>
+                <w:color w:val="EE0000"/>
+                <w:sz w:val="18"/>
+                <w:szCs w:val="18"/>
+              </w:rPr>
+              <w:t>(S22/SES7)</w:t>
+            </w:r>
+            <w:r>
+              <w:rPr>
+                <w:rFonts w:ascii="Calibri" w:hAnsi="Calibri" w:cs="Calibri"/>
+                <w:color w:val="EE0000"/>
+                <w:sz w:val="18"/>
+                <w:szCs w:val="18"/>
+              </w:rPr>
+              <w:t>   </w:t>
+            </w:r>
+          </w:p>
+        </w:tc>
+      </w:tr>
+      <w:tr>
+        <w:tc>
+          <w:tcPr>
+            <w:tcW w:w="1805" w:type="dxa"/>
+            <w:tcBorders>
+              <w:top w:val="single" w:sz="6" w:space="0" w:color="334047"/>
+              <w:left w:val="single" w:sz="6" w:space="0" w:color="334047"/>
+              <w:bottom w:val="single" w:sz="6" w:space="0" w:color="334047"/>
+              <w:right w:val="single" w:sz="6" w:space="0" w:color="334047"/>
+            </w:tcBorders>
+            <w:shd w:val="clear" w:color="auto" w:fill="F8E4F5"/>
+            <w:tcMar>
+              <w:top w:w="75" w:type="dxa"/>
+              <w:left w:w="150" w:type="dxa"/>
+              <w:bottom w:w="75" w:type="dxa"/>
+              <w:right w:w="150" w:type="dxa"/>
+            </w:tcMar>
+          </w:tcPr>
+          <w:p>
+            <w:pPr>
+              <w:jc w:val="center"/>
+              <w:rPr>
+                <w:b/>
+                <w:bCs/>
+              </w:rPr>
+            </w:pPr>
+            <w:r>
+              <w:rPr>
+                <w:b/>
+                <w:bCs/>
+              </w:rPr>
+              <w:t>S16</w:t>
+            </w:r>
+          </w:p>
+        </w:tc>
+        <w:tc>
+          <w:tcPr>
+            <w:tcW w:w="1805" w:type="dxa"/>
+            <w:gridSpan w:val="2"/>
+            <w:tcBorders>
+              <w:top w:val="single" w:sz="6" w:space="0" w:color="334047"/>
+              <w:left w:val="single" w:sz="6" w:space="0" w:color="334047"/>
+              <w:bottom w:val="single" w:sz="6" w:space="0" w:color="334047"/>
+              <w:right w:val="single" w:sz="6" w:space="0" w:color="334047"/>
+            </w:tcBorders>
+            <w:shd w:val="clear" w:color="auto" w:fill="F8E4F5"/>
+          </w:tcPr>
+          <w:p>
+            <w:pPr>
+              <w:jc w:val="center"/>
+              <w:rPr>
+                <w:b/>
+                <w:bCs/>
+              </w:rPr>
+            </w:pPr>
+            <w:r>
+              <w:rPr>
+                <w:b/>
+                <w:bCs/>
+              </w:rPr>
+              <w:t>S17</w:t>
+            </w:r>
+          </w:p>
+        </w:tc>
+        <w:tc>
+          <w:tcPr>
+            <w:tcW w:w="1805" w:type="dxa"/>
+            <w:tcBorders>
+              <w:top w:val="single" w:sz="6" w:space="0" w:color="334047"/>
+              <w:left w:val="single" w:sz="6" w:space="0" w:color="334047"/>
+              <w:bottom w:val="single" w:sz="6" w:space="0" w:color="334047"/>
+              <w:right w:val="single" w:sz="6" w:space="0" w:color="334047"/>
+            </w:tcBorders>
+            <w:shd w:val="clear" w:color="auto" w:fill="F8E4F5"/>
+          </w:tcPr>
+          <w:p>
+            <w:pPr>
+              <w:jc w:val="center"/>
+              <w:rPr>
+                <w:b/>
+                <w:bCs/>
+              </w:rPr>
+            </w:pPr>
+            <w:r>
+              <w:rPr>
+                <w:b/>
+                <w:bCs/>
+              </w:rPr>
+              <w:t>S18</w:t>
+            </w:r>
+          </w:p>
+        </w:tc>
+        <w:tc>
+          <w:tcPr>
+            <w:tcW w:w="1805" w:type="dxa"/>
+            <w:gridSpan w:val="2"/>
+            <w:tcBorders>
+              <w:top w:val="single" w:sz="6" w:space="0" w:color="334047"/>
+              <w:left w:val="single" w:sz="6" w:space="0" w:color="334047"/>
+              <w:bottom w:val="single" w:sz="6" w:space="0" w:color="334047"/>
+              <w:right w:val="single" w:sz="6" w:space="0" w:color="334047"/>
+            </w:tcBorders>
+            <w:shd w:val="clear" w:color="auto" w:fill="F8E4F5"/>
+          </w:tcPr>
+          <w:p>
+            <w:pPr>
+              <w:jc w:val="center"/>
+              <w:rPr>
+                <w:b/>
+                <w:bCs/>
+              </w:rPr>
+            </w:pPr>
+            <w:r>
+              <w:rPr>
+                <w:b/>
+                <w:bCs/>
+              </w:rPr>
+              <w:t>A19</w:t>
+            </w:r>
+          </w:p>
+        </w:tc>
+        <w:tc>
+          <w:tcPr>
+            <w:tcW w:w="1805" w:type="dxa"/>
+            <w:tcBorders>
+              <w:top w:val="single" w:sz="6" w:space="0" w:color="334047"/>
+              <w:left w:val="single" w:sz="6" w:space="0" w:color="334047"/>
+              <w:bottom w:val="single" w:sz="6" w:space="0" w:color="334047"/>
+              <w:right w:val="single" w:sz="6" w:space="0" w:color="334047"/>
+            </w:tcBorders>
+            <w:shd w:val="clear" w:color="auto" w:fill="F8E4F5"/>
+          </w:tcPr>
+          <w:p>
+            <w:pPr>
+              <w:jc w:val="center"/>
+              <w:rPr>
+                <w:b/>
+                <w:bCs/>
+              </w:rPr>
+            </w:pPr>
+            <w:r>
+              <w:rPr>
+                <w:b/>
+                <w:bCs/>
+              </w:rPr>
+              <w:t>S22</w:t>
+            </w:r>
+          </w:p>
+        </w:tc>
+        <w:tc>
+          <w:tcPr>
+            <w:tcW w:w="1805" w:type="dxa"/>
+            <w:tcBorders>
+              <w:top w:val="single" w:sz="6" w:space="0" w:color="334047"/>
+              <w:left w:val="single" w:sz="6" w:space="0" w:color="334047"/>
+              <w:bottom w:val="single" w:sz="6" w:space="0" w:color="334047"/>
+              <w:right w:val="single" w:sz="6" w:space="0" w:color="334047"/>
+            </w:tcBorders>
+            <w:shd w:val="clear" w:color="auto" w:fill="F8E4F5"/>
+          </w:tcPr>
+          <w:p>
+            <w:pPr>
+              <w:jc w:val="center"/>
+              <w:rPr>
+                <w:b/>
+                <w:bCs/>
+              </w:rPr>
+            </w:pPr>
+          </w:p>
+        </w:tc>
+      </w:tr>
+    </w:tbl>
+    <w:p/>
+    <w:p/>
     <w:p>
       <w:pPr>
         <w:rPr>

</xml_diff>